<commit_message>
docs: align output standards and OAuth guidance
Co-authored-by: sushioo170506-ship-it <sushioo170506-ship-it@users.noreply.github.com>
</commit_message>
<xml_diff>
--- a/outputs/gpt-live-application-research/gpt-live应用探索研究报告.docx
+++ b/outputs/gpt-live-application-research/gpt-live应用探索研究报告.docx
@@ -410,6 +410,21 @@
       </w:tr>
     </w:tbl>
     <w:p>
+      <w:pPr>
+        <w:pStyle w:val="Quote"/>
+      </w:pPr>
+      <w:r/>
+      <w:r>
+        <w:rPr>
+          <w:b/>
+        </w:rPr>
+        <w:t>表格说明：</w:t>
+      </w:r>
+      <w:r>
+        <w:t xml:space="preserve"> 本表以“产品、用户、后台智能、当前渠道、关键限制”为字段，共整理3条记录。指标定义以表头、单位和同一统计口径为准；核心结论应依据同列横向比较、同行关联及表内来源推导，不得脱离原表外推。</w:t>
+      </w:r>
+    </w:p>
+    <w:p>
       <w:r>
         <w:t>来源：</w:t>
       </w:r>
@@ -553,29 +568,68 @@
           <w:rFonts w:ascii="Consolas" w:hAnsi="Consolas"/>
           <w:sz w:val="16"/>
         </w:rPr>
-        <w:t>text</w:t>
+        <w:t>mermaid</w:t>
         <w:br/>
-        <w:t>级联式：</w:t>
+        <w:t>flowchart TD</w:t>
         <w:br/>
-        <w:t>用户音频 → ASR → 文本LLM → TTS → 输出音频</w:t>
+        <w:t xml:space="preserve">    N1["级联式"]</w:t>
+        <w:br/>
+        <w:t xml:space="preserve">    N2["用户音频"]</w:t>
+        <w:br/>
+        <w:t xml:space="preserve">    N3["ASR"]</w:t>
+        <w:br/>
+        <w:t xml:space="preserve">    N4["文本LLM"]</w:t>
+        <w:br/>
+        <w:t xml:space="preserve">    N5["TTS"]</w:t>
+        <w:br/>
+        <w:t xml:space="preserve">    N6["输出音频"]</w:t>
+        <w:br/>
+        <w:t xml:space="preserve">    N7["轮次式原生语音"]</w:t>
+        <w:br/>
+        <w:t xml:space="preserve">    N8["用户完整一轮音频"]</w:t>
+        <w:br/>
+        <w:t xml:space="preserve">    N9["单一音频模型"]</w:t>
+        <w:br/>
+        <w:t xml:space="preserve">    N10["完整一轮音频"]</w:t>
+        <w:br/>
+        <w:t xml:space="preserve">    N11["GPT-Live"]</w:t>
+        <w:br/>
+        <w:t xml:space="preserve">    N12["持续输入音频"]</w:t>
+        <w:br/>
+        <w:t xml:space="preserve">    N13["GPT-Live全双工交互控制"]</w:t>
+        <w:br/>
+        <w:t xml:space="preserve">    N14["持续输出音频"]</w:t>
+        <w:br/>
+        <w:t xml:space="preserve">    N15["搜索 / GPT-5.5推理 / Agent任务"]</w:t>
+        <w:br/>
+        <w:t xml:space="preserve">    N16["异步返回结果"]</w:t>
+        <w:br/>
+        <w:t xml:space="preserve">    N2 --&gt; N3</w:t>
+        <w:br/>
+        <w:t xml:space="preserve">    N3 --&gt; N4</w:t>
+        <w:br/>
+        <w:t xml:space="preserve">    N4 --&gt; N5</w:t>
+        <w:br/>
+        <w:t xml:space="preserve">    N5 --&gt; N6</w:t>
+        <w:br/>
+        <w:t xml:space="preserve">    N8 --&gt; N9</w:t>
+        <w:br/>
+        <w:t xml:space="preserve">    N9 --&gt; N10</w:t>
+        <w:br/>
+        <w:t xml:space="preserve">    N12 --&gt;|双向| N13</w:t>
+        <w:br/>
+        <w:t xml:space="preserve">    N13 --&gt; N12</w:t>
+        <w:br/>
+        <w:t xml:space="preserve">    N13 --&gt;|双向| N14</w:t>
         <w:br/>
         <w:br/>
-        <w:t>轮次式原生语音：</w:t>
+        <w:t>&gt; **表格说明：** 本表以“N12 --&gt;、双向、N13”为字段，共整理1条记录。指标定义以表头、单位和同一统计口径为准；核心结论应依据同列横向比较、同行关联及表内来源推导，不得脱离原表外推。</w:t>
         <w:br/>
-        <w:t>用户完整一轮音频 → 单一音频模型 → 完整一轮音频</w:t>
+        <w:t xml:space="preserve">    N14 --&gt; N13</w:t>
         <w:br/>
+        <w:t xml:space="preserve">    N14 --&gt; N15</w:t>
         <w:br/>
-        <w:t>GPT-Live：</w:t>
-        <w:br/>
-        <w:t>持续输入音频 ⇄ GPT-Live全双工交互控制 ⇄ 持续输出音频</w:t>
-        <w:br/>
-        <w:t xml:space="preserve">                         ↓</w:t>
-        <w:br/>
-        <w:t xml:space="preserve">              搜索 / GPT-5.5推理 / Agent任务</w:t>
-        <w:br/>
-        <w:t xml:space="preserve">                         ↓</w:t>
-        <w:br/>
-        <w:t xml:space="preserve">                    异步返回结果</w:t>
+        <w:t xml:space="preserve">    N15 --&gt; N16</w:t>
       </w:r>
     </w:p>
     <w:p>
@@ -1266,6 +1320,21 @@
     </w:tbl>
     <w:p>
       <w:pPr>
+        <w:pStyle w:val="Quote"/>
+      </w:pPr>
+      <w:r/>
+      <w:r>
+        <w:rPr>
+          <w:b/>
+        </w:rPr>
+        <w:t>表格说明：</w:t>
+      </w:r>
+      <w:r>
+        <w:t xml:space="preserve"> 本表以“能力、当前表现判断、证据、边界”为字段，共整理10条记录。指标定义以表头、单位和同一统计口径为准；核心结论应依据同列横向比较、同行关联及表内来源推导，不得脱离原表外推。</w:t>
+      </w:r>
+    </w:p>
+    <w:p>
+      <w:pPr>
         <w:pStyle w:val="Heading3"/>
       </w:pPr>
       <w:r>
@@ -1666,6 +1735,21 @@
       </w:tr>
     </w:tbl>
     <w:p>
+      <w:pPr>
+        <w:pStyle w:val="Quote"/>
+      </w:pPr>
+      <w:r/>
+      <w:r>
+        <w:rPr>
+          <w:b/>
+        </w:rPr>
+        <w:t>表格说明：</w:t>
+      </w:r>
+      <w:r>
+        <w:t xml:space="preserve"> 本表以“评测、GPT‑Live‑1、GPT‑Live‑1 mini、Advanced Voice Mode、解读”为字段，共整理6条记录。指标定义以表头、单位和同一统计口径为准；核心结论应依据同列横向比较、同行关联及表内来源推导，不得脱离原表外推。</w:t>
+      </w:r>
+    </w:p>
+    <w:p>
       <w:r>
         <w:t>说明：OpenAI正文对评测给出方向性结论，图表数字由官方页面图表的媒体转录交叉核对。</w:t>
       </w:r>
@@ -2095,6 +2179,21 @@
       </w:tr>
     </w:tbl>
     <w:p>
+      <w:pPr>
+        <w:pStyle w:val="Quote"/>
+      </w:pPr>
+      <w:r/>
+      <w:r>
+        <w:rPr>
+          <w:b/>
+        </w:rPr>
+        <w:t>表格说明：</w:t>
+      </w:r>
+      <w:r>
+        <w:t xml:space="preserve"> 本表以“产品、技术路线、主要优势、相对GPT‑Live差异/限制”为字段，共整理5条记录。指标定义以表头、单位和同一统计口径为准；核心结论应依据同列横向比较、同行关联及表内来源推导，不得脱离原表外推。</w:t>
+      </w:r>
+    </w:p>
+    <w:p>
       <w:r>
         <w:t>Gemini数据来源：</w:t>
       </w:r>
@@ -2390,6 +2489,21 @@
         </w:tc>
       </w:tr>
     </w:tbl>
+    <w:p>
+      <w:pPr>
+        <w:pStyle w:val="Quote"/>
+      </w:pPr>
+      <w:r/>
+      <w:r>
+        <w:rPr>
+          <w:b/>
+        </w:rPr>
+        <w:t>表格说明：</w:t>
+      </w:r>
+      <w:r>
+        <w:t xml:space="preserve"> 本表以“产品、架构/路线、能力特点、主要边界”为字段，共整理4条记录。指标定义以表头、单位和同一统计口径为准；核心结论应依据同列横向比较、同行关联及表内来源推导，不得脱离原表外推。</w:t>
+      </w:r>
+    </w:p>
     <w:p>
       <w:r>
         <w:t>来源：</w:t>
@@ -3545,6 +3659,21 @@
     </w:tbl>
     <w:p>
       <w:pPr>
+        <w:pStyle w:val="Quote"/>
+      </w:pPr>
+      <w:r/>
+      <w:r>
+        <w:rPr>
+          <w:b/>
+        </w:rPr>
+        <w:t>表格说明：</w:t>
+      </w:r>
+      <w:r>
+        <w:t xml:space="preserve"> 本表以“场景、用户需求、GPT‑Live适配度、风险、建议”为字段，共整理11条记录。指标定义以表头、单位和同一统计口径为准；核心结论应依据同列横向比较、同行关联及表内来源推导，不得脱离原表外推。</w:t>
+      </w:r>
+    </w:p>
+    <w:p>
+      <w:pPr>
         <w:pStyle w:val="Heading3"/>
       </w:pPr>
       <w:r>
@@ -3954,6 +4083,21 @@
     </w:tbl>
     <w:p>
       <w:pPr>
+        <w:pStyle w:val="Quote"/>
+      </w:pPr>
+      <w:r/>
+      <w:r>
+        <w:rPr>
+          <w:b/>
+        </w:rPr>
+        <w:t>表格说明：</w:t>
+      </w:r>
+      <w:r>
+        <w:t xml:space="preserve"> 本表以“维度、最低覆盖”为字段，共整理6条记录。指标定义以表头、单位和同一统计口径为准；核心结论应依据同列横向比较、同行关联及表内来源推导，不得脱离原表外推。</w:t>
+      </w:r>
+    </w:p>
+    <w:p>
+      <w:pPr>
         <w:pStyle w:val="Heading2"/>
       </w:pPr>
       <w:r>
@@ -4287,6 +4431,366 @@
       <w:r>
         <w:t>证据声明：OpenAI、Google、阿里云、火山引擎、xAI等来源均可能包含厂商立场；报告未进行模型API实测。GPT‑Live于报告日前5天发布，独立研究仍有限，涉及评测和产品可用性的结论应随API开放和第三方复现更新。</w:t>
       </w:r>
+    </w:p>
+    <w:p>
+      <w:pPr>
+        <w:pStyle w:val="Heading2"/>
+      </w:pPr>
+      <w:r>
+        <w:t>全量关联链接</w:t>
+      </w:r>
+    </w:p>
+    <w:p>
+      <w:pPr>
+        <w:pStyle w:val="ListNumber"/>
+      </w:pPr>
+      <w:r/>
+      <w:hyperlink r:id="rId9">
+        <w:r>
+          <w:rPr>
+            <w:color w:val="0563C1"/>
+            <w:u w:val="single"/>
+          </w:rPr>
+          <w:t>OpenAI官方发布</w:t>
+        </w:r>
+      </w:hyperlink>
+      <w:r/>
+    </w:p>
+    <w:p>
+      <w:pPr>
+        <w:pStyle w:val="ListNumber"/>
+      </w:pPr>
+      <w:r/>
+      <w:hyperlink r:id="rId10">
+        <w:r>
+          <w:rPr>
+            <w:color w:val="0563C1"/>
+            <w:u w:val="single"/>
+          </w:rPr>
+          <w:t>The Decoder转录</w:t>
+        </w:r>
+      </w:hyperlink>
+      <w:r/>
+    </w:p>
+    <w:p>
+      <w:pPr>
+        <w:pStyle w:val="ListNumber"/>
+      </w:pPr>
+      <w:r/>
+      <w:hyperlink r:id="rId11">
+        <w:r>
+          <w:rPr>
+            <w:color w:val="0563C1"/>
+            <w:u w:val="single"/>
+          </w:rPr>
+          <w:t>ChatGPT Voice帮助中心</w:t>
+        </w:r>
+      </w:hyperlink>
+      <w:r/>
+    </w:p>
+    <w:p>
+      <w:pPr>
+        <w:pStyle w:val="ListNumber"/>
+      </w:pPr>
+      <w:r/>
+      <w:hyperlink r:id="rId12">
+        <w:r>
+          <w:rPr>
+            <w:color w:val="0563C1"/>
+            <w:u w:val="single"/>
+          </w:rPr>
+          <w:t>OpenAI Realtime开发文档</w:t>
+        </w:r>
+      </w:hyperlink>
+      <w:r/>
+    </w:p>
+    <w:p>
+      <w:pPr>
+        <w:pStyle w:val="ListNumber"/>
+      </w:pPr>
+      <w:r/>
+      <w:hyperlink r:id="rId13">
+        <w:r>
+          <w:rPr>
+            <w:color w:val="0563C1"/>
+            <w:u w:val="single"/>
+          </w:rPr>
+          <w:t>RuntimeWire</w:t>
+        </w:r>
+      </w:hyperlink>
+      <w:r/>
+    </w:p>
+    <w:p>
+      <w:pPr>
+        <w:pStyle w:val="ListNumber"/>
+      </w:pPr>
+      <w:r/>
+      <w:hyperlink r:id="rId14">
+        <w:r>
+          <w:rPr>
+            <w:color w:val="0563C1"/>
+            <w:u w:val="single"/>
+          </w:rPr>
+          <w:t>Agora测试转录</w:t>
+        </w:r>
+      </w:hyperlink>
+      <w:r/>
+    </w:p>
+    <w:p>
+      <w:pPr>
+        <w:pStyle w:val="ListNumber"/>
+      </w:pPr>
+      <w:r/>
+      <w:hyperlink r:id="rId15">
+        <w:r>
+          <w:rPr>
+            <w:color w:val="0563C1"/>
+            <w:u w:val="single"/>
+          </w:rPr>
+          <w:t>Live API概览</w:t>
+        </w:r>
+      </w:hyperlink>
+      <w:r/>
+    </w:p>
+    <w:p>
+      <w:pPr>
+        <w:pStyle w:val="ListNumber"/>
+      </w:pPr>
+      <w:r/>
+      <w:hyperlink r:id="rId16">
+        <w:r>
+          <w:rPr>
+            <w:color w:val="0563C1"/>
+            <w:u w:val="single"/>
+          </w:rPr>
+          <w:t>会话管理</w:t>
+        </w:r>
+      </w:hyperlink>
+      <w:r/>
+    </w:p>
+    <w:p>
+      <w:pPr>
+        <w:pStyle w:val="ListNumber"/>
+      </w:pPr>
+      <w:r/>
+      <w:hyperlink r:id="rId17">
+        <w:r>
+          <w:rPr>
+            <w:color w:val="0563C1"/>
+            <w:u w:val="single"/>
+          </w:rPr>
+          <w:t>工具能力</w:t>
+        </w:r>
+      </w:hyperlink>
+      <w:r/>
+    </w:p>
+    <w:p>
+      <w:pPr>
+        <w:pStyle w:val="ListNumber"/>
+      </w:pPr>
+      <w:r/>
+      <w:hyperlink r:id="rId18">
+        <w:r>
+          <w:rPr>
+            <w:color w:val="0563C1"/>
+            <w:u w:val="single"/>
+          </w:rPr>
+          <w:t>Voice Agent API</w:t>
+        </w:r>
+      </w:hyperlink>
+      <w:r/>
+    </w:p>
+    <w:p>
+      <w:pPr>
+        <w:pStyle w:val="ListNumber"/>
+      </w:pPr>
+      <w:r/>
+      <w:hyperlink r:id="rId19">
+        <w:r>
+          <w:rPr>
+            <w:color w:val="0563C1"/>
+            <w:u w:val="single"/>
+          </w:rPr>
+          <w:t>Qwen3.5‑Omni技术报告</w:t>
+        </w:r>
+      </w:hyperlink>
+      <w:r/>
+    </w:p>
+    <w:p>
+      <w:pPr>
+        <w:pStyle w:val="ListNumber"/>
+      </w:pPr>
+      <w:r/>
+      <w:hyperlink r:id="rId20">
+        <w:r>
+          <w:rPr>
+            <w:color w:val="0563C1"/>
+            <w:u w:val="single"/>
+          </w:rPr>
+          <w:t>Qwen实时API限制</w:t>
+        </w:r>
+      </w:hyperlink>
+      <w:r/>
+    </w:p>
+    <w:p>
+      <w:pPr>
+        <w:pStyle w:val="ListNumber"/>
+      </w:pPr>
+      <w:r/>
+      <w:hyperlink r:id="rId21">
+        <w:r>
+          <w:rPr>
+            <w:color w:val="0563C1"/>
+            <w:u w:val="single"/>
+          </w:rPr>
+          <w:t>豆包实时语音产品说明</w:t>
+        </w:r>
+      </w:hyperlink>
+      <w:r/>
+    </w:p>
+    <w:p>
+      <w:pPr>
+        <w:pStyle w:val="ListNumber"/>
+      </w:pPr>
+      <w:r/>
+      <w:hyperlink r:id="rId22">
+        <w:r>
+          <w:rPr>
+            <w:color w:val="0563C1"/>
+            <w:u w:val="single"/>
+          </w:rPr>
+          <w:t>火山实时对话方案</w:t>
+        </w:r>
+      </w:hyperlink>
+      <w:r/>
+    </w:p>
+    <w:p>
+      <w:pPr>
+        <w:pStyle w:val="ListNumber"/>
+      </w:pPr>
+      <w:r/>
+      <w:hyperlink r:id="rId23">
+        <w:r>
+          <w:rPr>
+            <w:color w:val="0563C1"/>
+            <w:u w:val="single"/>
+          </w:rPr>
+          <w:t>MiniMax Realtime</w:t>
+        </w:r>
+      </w:hyperlink>
+      <w:r/>
+    </w:p>
+    <w:p>
+      <w:pPr>
+        <w:pStyle w:val="ListNumber"/>
+      </w:pPr>
+      <w:r/>
+      <w:hyperlink r:id="rId24">
+        <w:r>
+          <w:rPr>
+            <w:color w:val="0563C1"/>
+            <w:u w:val="single"/>
+          </w:rPr>
+          <w:t>腾讯TRTC方案</w:t>
+        </w:r>
+      </w:hyperlink>
+      <w:r/>
+    </w:p>
+    <w:p>
+      <w:pPr>
+        <w:pStyle w:val="ListNumber"/>
+      </w:pPr>
+      <w:r/>
+      <w:hyperlink r:id="rId25">
+        <w:r>
+          <w:rPr>
+            <w:color w:val="0563C1"/>
+            <w:u w:val="single"/>
+          </w:rPr>
+          <w:t>GPT‑Live系统卡</w:t>
+        </w:r>
+      </w:hyperlink>
+      <w:r/>
+    </w:p>
+    <w:p>
+      <w:pPr>
+        <w:pStyle w:val="ListNumber"/>
+      </w:pPr>
+      <w:r/>
+      <w:hyperlink r:id="rId26">
+        <w:r>
+          <w:rPr>
+            <w:color w:val="0563C1"/>
+            <w:u w:val="single"/>
+          </w:rPr>
+          <w:t>Gartner</w:t>
+        </w:r>
+      </w:hyperlink>
+      <w:r/>
+    </w:p>
+    <w:p>
+      <w:pPr>
+        <w:pStyle w:val="ListNumber"/>
+      </w:pPr>
+      <w:r/>
+      <w:hyperlink r:id="rId27">
+        <w:r>
+          <w:rPr>
+            <w:color w:val="0563C1"/>
+            <w:u w:val="single"/>
+          </w:rPr>
+          <w:t>Gartner</w:t>
+        </w:r>
+      </w:hyperlink>
+      <w:r/>
+    </w:p>
+    <w:p>
+      <w:pPr>
+        <w:pStyle w:val="ListNumber"/>
+      </w:pPr>
+      <w:r/>
+      <w:hyperlink r:id="rId28">
+        <w:r>
+          <w:rPr>
+            <w:color w:val="0563C1"/>
+            <w:u w:val="single"/>
+          </w:rPr>
+          <w:t>OpenAI/Travelers案例</w:t>
+        </w:r>
+      </w:hyperlink>
+      <w:r/>
+    </w:p>
+    <w:p>
+      <w:pPr>
+        <w:pStyle w:val="ListNumber"/>
+      </w:pPr>
+      <w:r/>
+      <w:hyperlink r:id="rId29">
+        <w:r>
+          <w:rPr>
+            <w:color w:val="0563C1"/>
+            <w:u w:val="single"/>
+          </w:rPr>
+          <w:t>OpenAI：Introducing gpt‑realtime</w:t>
+        </w:r>
+      </w:hyperlink>
+      <w:r/>
+    </w:p>
+    <w:p>
+      <w:pPr>
+        <w:pStyle w:val="ListNumber"/>
+      </w:pPr>
+      <w:r/>
+      <w:hyperlink r:id="rId30">
+        <w:r>
+          <w:rPr>
+            <w:color w:val="0563C1"/>
+            <w:u w:val="single"/>
+          </w:rPr>
+          <w:t>Qwen：Qwen2.5‑Omni架构说明</w:t>
+        </w:r>
+      </w:hyperlink>
+      <w:r/>
     </w:p>
     <w:sectPr>
       <w:pgSz w:w="12240" w:h="15840"/>

</xml_diff>

<commit_message>
docs: validate standardized report outputs
Co-authored-by: sushioo170506-ship-it <sushioo170506-ship-it@users.noreply.github.com>
</commit_message>
<xml_diff>
--- a/outputs/gpt-live-application-research/gpt-live应用探索研究报告.docx
+++ b/outputs/gpt-live-application-research/gpt-live应用探索研究报告.docx
@@ -561,77 +561,612 @@
     </w:p>
     <w:p>
       <w:pPr>
-        <w:pStyle w:val="NoSpacing"/>
+        <w:pStyle w:val="Heading3"/>
       </w:pPr>
       <w:r>
-        <w:rPr>
-          <w:rFonts w:ascii="Consolas" w:hAnsi="Consolas"/>
-          <w:sz w:val="16"/>
-        </w:rPr>
-        <w:t>mermaid</w:t>
-        <w:br/>
-        <w:t>flowchart TD</w:t>
-        <w:br/>
-        <w:t xml:space="preserve">    N1["级联式"]</w:t>
-        <w:br/>
-        <w:t xml:space="preserve">    N2["用户音频"]</w:t>
-        <w:br/>
-        <w:t xml:space="preserve">    N3["ASR"]</w:t>
-        <w:br/>
-        <w:t xml:space="preserve">    N4["文本LLM"]</w:t>
-        <w:br/>
-        <w:t xml:space="preserve">    N5["TTS"]</w:t>
-        <w:br/>
-        <w:t xml:space="preserve">    N6["输出音频"]</w:t>
-        <w:br/>
-        <w:t xml:space="preserve">    N7["轮次式原生语音"]</w:t>
-        <w:br/>
-        <w:t xml:space="preserve">    N8["用户完整一轮音频"]</w:t>
-        <w:br/>
-        <w:t xml:space="preserve">    N9["单一音频模型"]</w:t>
-        <w:br/>
-        <w:t xml:space="preserve">    N10["完整一轮音频"]</w:t>
-        <w:br/>
-        <w:t xml:space="preserve">    N11["GPT-Live"]</w:t>
-        <w:br/>
-        <w:t xml:space="preserve">    N12["持续输入音频"]</w:t>
-        <w:br/>
-        <w:t xml:space="preserve">    N13["GPT-Live全双工交互控制"]</w:t>
-        <w:br/>
-        <w:t xml:space="preserve">    N14["持续输出音频"]</w:t>
-        <w:br/>
-        <w:t xml:space="preserve">    N15["搜索 / GPT-5.5推理 / Agent任务"]</w:t>
-        <w:br/>
-        <w:t xml:space="preserve">    N16["异步返回结果"]</w:t>
-        <w:br/>
-        <w:t xml:space="preserve">    N2 --&gt; N3</w:t>
-        <w:br/>
-        <w:t xml:space="preserve">    N3 --&gt; N4</w:t>
-        <w:br/>
-        <w:t xml:space="preserve">    N4 --&gt; N5</w:t>
-        <w:br/>
-        <w:t xml:space="preserve">    N5 --&gt; N6</w:t>
-        <w:br/>
-        <w:t xml:space="preserve">    N8 --&gt; N9</w:t>
-        <w:br/>
-        <w:t xml:space="preserve">    N9 --&gt; N10</w:t>
-        <w:br/>
-        <w:t xml:space="preserve">    N12 --&gt;|双向| N13</w:t>
-        <w:br/>
-        <w:t xml:space="preserve">    N13 --&gt; N12</w:t>
-        <w:br/>
-        <w:t xml:space="preserve">    N13 --&gt;|双向| N14</w:t>
-        <w:br/>
-        <w:br/>
-        <w:t>&gt; **表格说明：** 本表以“N12 --&gt;、双向、N13”为字段，共整理1条记录。指标定义以表头、单位和同一统计口径为准；核心结论应依据同列横向比较、同行关联及表内来源推导，不得脱离原表外推。</w:t>
-        <w:br/>
-        <w:t xml:space="preserve">    N14 --&gt; N13</w:t>
-        <w:br/>
-        <w:t xml:space="preserve">    N14 --&gt; N15</w:t>
-        <w:br/>
-        <w:t xml:space="preserve">    N15 --&gt; N16</w:t>
+        <w:t>结构化流程图</w:t>
       </w:r>
     </w:p>
+    <w:tbl>
+      <w:tblPr>
+        <w:tblStyle w:val="LightShading-Accent1"/>
+        <w:tblW w:type="auto" w:w="0"/>
+        <w:tblLook w:firstColumn="1" w:firstRow="1" w:lastColumn="0" w:lastRow="0" w:noHBand="0" w:noVBand="1" w:val="04A0"/>
+      </w:tblPr>
+      <w:tblGrid>
+        <w:gridCol w:w="3173"/>
+        <w:gridCol w:w="3173"/>
+        <w:gridCol w:w="3173"/>
+      </w:tblGrid>
+      <w:tr>
+        <w:tc>
+          <w:tcPr>
+            <w:tcW w:type="dxa" w:w="3173"/>
+          </w:tcPr>
+          <w:p>
+            <w:r>
+              <w:rPr>
+                <w:b/>
+              </w:rPr>
+              <w:t>用户音频</w:t>
+            </w:r>
+          </w:p>
+        </w:tc>
+        <w:tc>
+          <w:tcPr>
+            <w:tcW w:type="dxa" w:w="3173"/>
+          </w:tcPr>
+          <w:p>
+            <w:r>
+              <w:t>→</w:t>
+            </w:r>
+          </w:p>
+        </w:tc>
+        <w:tc>
+          <w:tcPr>
+            <w:tcW w:type="dxa" w:w="3173"/>
+          </w:tcPr>
+          <w:p>
+            <w:r>
+              <w:rPr>
+                <w:b/>
+              </w:rPr>
+              <w:t>ASR</w:t>
+            </w:r>
+          </w:p>
+        </w:tc>
+      </w:tr>
+    </w:tbl>
+    <w:tbl>
+      <w:tblPr>
+        <w:tblStyle w:val="LightShading-Accent1"/>
+        <w:tblW w:type="auto" w:w="0"/>
+        <w:tblLook w:firstColumn="1" w:firstRow="1" w:lastColumn="0" w:lastRow="0" w:noHBand="0" w:noVBand="1" w:val="04A0"/>
+      </w:tblPr>
+      <w:tblGrid>
+        <w:gridCol w:w="3173"/>
+        <w:gridCol w:w="3173"/>
+        <w:gridCol w:w="3173"/>
+      </w:tblGrid>
+      <w:tr>
+        <w:tc>
+          <w:tcPr>
+            <w:tcW w:type="dxa" w:w="3173"/>
+          </w:tcPr>
+          <w:p>
+            <w:r>
+              <w:rPr>
+                <w:b/>
+              </w:rPr>
+              <w:t>ASR</w:t>
+            </w:r>
+          </w:p>
+        </w:tc>
+        <w:tc>
+          <w:tcPr>
+            <w:tcW w:type="dxa" w:w="3173"/>
+          </w:tcPr>
+          <w:p>
+            <w:r>
+              <w:t>→</w:t>
+            </w:r>
+          </w:p>
+        </w:tc>
+        <w:tc>
+          <w:tcPr>
+            <w:tcW w:type="dxa" w:w="3173"/>
+          </w:tcPr>
+          <w:p>
+            <w:r>
+              <w:rPr>
+                <w:b/>
+              </w:rPr>
+              <w:t>文本LLM</w:t>
+            </w:r>
+          </w:p>
+        </w:tc>
+      </w:tr>
+    </w:tbl>
+    <w:tbl>
+      <w:tblPr>
+        <w:tblStyle w:val="LightShading-Accent1"/>
+        <w:tblW w:type="auto" w:w="0"/>
+        <w:tblLook w:firstColumn="1" w:firstRow="1" w:lastColumn="0" w:lastRow="0" w:noHBand="0" w:noVBand="1" w:val="04A0"/>
+      </w:tblPr>
+      <w:tblGrid>
+        <w:gridCol w:w="3173"/>
+        <w:gridCol w:w="3173"/>
+        <w:gridCol w:w="3173"/>
+      </w:tblGrid>
+      <w:tr>
+        <w:tc>
+          <w:tcPr>
+            <w:tcW w:type="dxa" w:w="3173"/>
+          </w:tcPr>
+          <w:p>
+            <w:r>
+              <w:rPr>
+                <w:b/>
+              </w:rPr>
+              <w:t>文本LLM</w:t>
+            </w:r>
+          </w:p>
+        </w:tc>
+        <w:tc>
+          <w:tcPr>
+            <w:tcW w:type="dxa" w:w="3173"/>
+          </w:tcPr>
+          <w:p>
+            <w:r>
+              <w:t>→</w:t>
+            </w:r>
+          </w:p>
+        </w:tc>
+        <w:tc>
+          <w:tcPr>
+            <w:tcW w:type="dxa" w:w="3173"/>
+          </w:tcPr>
+          <w:p>
+            <w:r>
+              <w:rPr>
+                <w:b/>
+              </w:rPr>
+              <w:t>TTS</w:t>
+            </w:r>
+          </w:p>
+        </w:tc>
+      </w:tr>
+    </w:tbl>
+    <w:tbl>
+      <w:tblPr>
+        <w:tblStyle w:val="LightShading-Accent1"/>
+        <w:tblW w:type="auto" w:w="0"/>
+        <w:tblLook w:firstColumn="1" w:firstRow="1" w:lastColumn="0" w:lastRow="0" w:noHBand="0" w:noVBand="1" w:val="04A0"/>
+      </w:tblPr>
+      <w:tblGrid>
+        <w:gridCol w:w="3173"/>
+        <w:gridCol w:w="3173"/>
+        <w:gridCol w:w="3173"/>
+      </w:tblGrid>
+      <w:tr>
+        <w:tc>
+          <w:tcPr>
+            <w:tcW w:type="dxa" w:w="3173"/>
+          </w:tcPr>
+          <w:p>
+            <w:r>
+              <w:rPr>
+                <w:b/>
+              </w:rPr>
+              <w:t>TTS</w:t>
+            </w:r>
+          </w:p>
+        </w:tc>
+        <w:tc>
+          <w:tcPr>
+            <w:tcW w:type="dxa" w:w="3173"/>
+          </w:tcPr>
+          <w:p>
+            <w:r>
+              <w:t>→</w:t>
+            </w:r>
+          </w:p>
+        </w:tc>
+        <w:tc>
+          <w:tcPr>
+            <w:tcW w:type="dxa" w:w="3173"/>
+          </w:tcPr>
+          <w:p>
+            <w:r>
+              <w:rPr>
+                <w:b/>
+              </w:rPr>
+              <w:t>输出音频</w:t>
+            </w:r>
+          </w:p>
+        </w:tc>
+      </w:tr>
+    </w:tbl>
+    <w:tbl>
+      <w:tblPr>
+        <w:tblStyle w:val="LightShading-Accent1"/>
+        <w:tblW w:type="auto" w:w="0"/>
+        <w:tblLook w:firstColumn="1" w:firstRow="1" w:lastColumn="0" w:lastRow="0" w:noHBand="0" w:noVBand="1" w:val="04A0"/>
+      </w:tblPr>
+      <w:tblGrid>
+        <w:gridCol w:w="3173"/>
+        <w:gridCol w:w="3173"/>
+        <w:gridCol w:w="3173"/>
+      </w:tblGrid>
+      <w:tr>
+        <w:tc>
+          <w:tcPr>
+            <w:tcW w:type="dxa" w:w="3173"/>
+          </w:tcPr>
+          <w:p>
+            <w:r>
+              <w:rPr>
+                <w:b/>
+              </w:rPr>
+              <w:t>用户完整一轮音频</w:t>
+            </w:r>
+          </w:p>
+        </w:tc>
+        <w:tc>
+          <w:tcPr>
+            <w:tcW w:type="dxa" w:w="3173"/>
+          </w:tcPr>
+          <w:p>
+            <w:r>
+              <w:t>→</w:t>
+            </w:r>
+          </w:p>
+        </w:tc>
+        <w:tc>
+          <w:tcPr>
+            <w:tcW w:type="dxa" w:w="3173"/>
+          </w:tcPr>
+          <w:p>
+            <w:r>
+              <w:rPr>
+                <w:b/>
+              </w:rPr>
+              <w:t>单一音频模型</w:t>
+            </w:r>
+          </w:p>
+        </w:tc>
+      </w:tr>
+    </w:tbl>
+    <w:tbl>
+      <w:tblPr>
+        <w:tblStyle w:val="LightShading-Accent1"/>
+        <w:tblW w:type="auto" w:w="0"/>
+        <w:tblLook w:firstColumn="1" w:firstRow="1" w:lastColumn="0" w:lastRow="0" w:noHBand="0" w:noVBand="1" w:val="04A0"/>
+      </w:tblPr>
+      <w:tblGrid>
+        <w:gridCol w:w="3173"/>
+        <w:gridCol w:w="3173"/>
+        <w:gridCol w:w="3173"/>
+      </w:tblGrid>
+      <w:tr>
+        <w:tc>
+          <w:tcPr>
+            <w:tcW w:type="dxa" w:w="3173"/>
+          </w:tcPr>
+          <w:p>
+            <w:r>
+              <w:rPr>
+                <w:b/>
+              </w:rPr>
+              <w:t>单一音频模型</w:t>
+            </w:r>
+          </w:p>
+        </w:tc>
+        <w:tc>
+          <w:tcPr>
+            <w:tcW w:type="dxa" w:w="3173"/>
+          </w:tcPr>
+          <w:p>
+            <w:r>
+              <w:t>→</w:t>
+            </w:r>
+          </w:p>
+        </w:tc>
+        <w:tc>
+          <w:tcPr>
+            <w:tcW w:type="dxa" w:w="3173"/>
+          </w:tcPr>
+          <w:p>
+            <w:r>
+              <w:rPr>
+                <w:b/>
+              </w:rPr>
+              <w:t>完整一轮音频</w:t>
+            </w:r>
+          </w:p>
+        </w:tc>
+      </w:tr>
+    </w:tbl>
+    <w:tbl>
+      <w:tblPr>
+        <w:tblStyle w:val="LightShading-Accent1"/>
+        <w:tblW w:type="auto" w:w="0"/>
+        <w:tblLook w:firstColumn="1" w:firstRow="1" w:lastColumn="0" w:lastRow="0" w:noHBand="0" w:noVBand="1" w:val="04A0"/>
+      </w:tblPr>
+      <w:tblGrid>
+        <w:gridCol w:w="3173"/>
+        <w:gridCol w:w="3173"/>
+        <w:gridCol w:w="3173"/>
+      </w:tblGrid>
+      <w:tr>
+        <w:tc>
+          <w:tcPr>
+            <w:tcW w:type="dxa" w:w="3173"/>
+          </w:tcPr>
+          <w:p>
+            <w:r>
+              <w:rPr>
+                <w:b/>
+              </w:rPr>
+              <w:t>持续输入音频</w:t>
+            </w:r>
+          </w:p>
+        </w:tc>
+        <w:tc>
+          <w:tcPr>
+            <w:tcW w:type="dxa" w:w="3173"/>
+          </w:tcPr>
+          <w:p>
+            <w:r>
+              <w:t>→ 双向</w:t>
+            </w:r>
+          </w:p>
+        </w:tc>
+        <w:tc>
+          <w:tcPr>
+            <w:tcW w:type="dxa" w:w="3173"/>
+          </w:tcPr>
+          <w:p>
+            <w:r>
+              <w:rPr>
+                <w:b/>
+              </w:rPr>
+              <w:t>GPT-Live全双工交互控制</w:t>
+            </w:r>
+          </w:p>
+        </w:tc>
+      </w:tr>
+    </w:tbl>
+    <w:tbl>
+      <w:tblPr>
+        <w:tblStyle w:val="LightShading-Accent1"/>
+        <w:tblW w:type="auto" w:w="0"/>
+        <w:tblLook w:firstColumn="1" w:firstRow="1" w:lastColumn="0" w:lastRow="0" w:noHBand="0" w:noVBand="1" w:val="04A0"/>
+      </w:tblPr>
+      <w:tblGrid>
+        <w:gridCol w:w="3173"/>
+        <w:gridCol w:w="3173"/>
+        <w:gridCol w:w="3173"/>
+      </w:tblGrid>
+      <w:tr>
+        <w:tc>
+          <w:tcPr>
+            <w:tcW w:type="dxa" w:w="3173"/>
+          </w:tcPr>
+          <w:p>
+            <w:r>
+              <w:rPr>
+                <w:b/>
+              </w:rPr>
+              <w:t>GPT-Live全双工交互控制</w:t>
+            </w:r>
+          </w:p>
+        </w:tc>
+        <w:tc>
+          <w:tcPr>
+            <w:tcW w:type="dxa" w:w="3173"/>
+          </w:tcPr>
+          <w:p>
+            <w:r>
+              <w:t>→</w:t>
+            </w:r>
+          </w:p>
+        </w:tc>
+        <w:tc>
+          <w:tcPr>
+            <w:tcW w:type="dxa" w:w="3173"/>
+          </w:tcPr>
+          <w:p>
+            <w:r>
+              <w:rPr>
+                <w:b/>
+              </w:rPr>
+              <w:t>持续输入音频</w:t>
+            </w:r>
+          </w:p>
+        </w:tc>
+      </w:tr>
+    </w:tbl>
+    <w:tbl>
+      <w:tblPr>
+        <w:tblStyle w:val="LightShading-Accent1"/>
+        <w:tblW w:type="auto" w:w="0"/>
+        <w:tblLook w:firstColumn="1" w:firstRow="1" w:lastColumn="0" w:lastRow="0" w:noHBand="0" w:noVBand="1" w:val="04A0"/>
+      </w:tblPr>
+      <w:tblGrid>
+        <w:gridCol w:w="3173"/>
+        <w:gridCol w:w="3173"/>
+        <w:gridCol w:w="3173"/>
+      </w:tblGrid>
+      <w:tr>
+        <w:tc>
+          <w:tcPr>
+            <w:tcW w:type="dxa" w:w="3173"/>
+          </w:tcPr>
+          <w:p>
+            <w:r>
+              <w:rPr>
+                <w:b/>
+              </w:rPr>
+              <w:t>GPT-Live全双工交互控制</w:t>
+            </w:r>
+          </w:p>
+        </w:tc>
+        <w:tc>
+          <w:tcPr>
+            <w:tcW w:type="dxa" w:w="3173"/>
+          </w:tcPr>
+          <w:p>
+            <w:r>
+              <w:t>→ 双向</w:t>
+            </w:r>
+          </w:p>
+        </w:tc>
+        <w:tc>
+          <w:tcPr>
+            <w:tcW w:type="dxa" w:w="3173"/>
+          </w:tcPr>
+          <w:p>
+            <w:r>
+              <w:rPr>
+                <w:b/>
+              </w:rPr>
+              <w:t>持续输出音频</w:t>
+            </w:r>
+          </w:p>
+        </w:tc>
+      </w:tr>
+    </w:tbl>
+    <w:tbl>
+      <w:tblPr>
+        <w:tblStyle w:val="LightShading-Accent1"/>
+        <w:tblW w:type="auto" w:w="0"/>
+        <w:tblLook w:firstColumn="1" w:firstRow="1" w:lastColumn="0" w:lastRow="0" w:noHBand="0" w:noVBand="1" w:val="04A0"/>
+      </w:tblPr>
+      <w:tblGrid>
+        <w:gridCol w:w="3173"/>
+        <w:gridCol w:w="3173"/>
+        <w:gridCol w:w="3173"/>
+      </w:tblGrid>
+      <w:tr>
+        <w:tc>
+          <w:tcPr>
+            <w:tcW w:type="dxa" w:w="3173"/>
+          </w:tcPr>
+          <w:p>
+            <w:r>
+              <w:rPr>
+                <w:b/>
+              </w:rPr>
+              <w:t>持续输出音频</w:t>
+            </w:r>
+          </w:p>
+        </w:tc>
+        <w:tc>
+          <w:tcPr>
+            <w:tcW w:type="dxa" w:w="3173"/>
+          </w:tcPr>
+          <w:p>
+            <w:r>
+              <w:t>→</w:t>
+            </w:r>
+          </w:p>
+        </w:tc>
+        <w:tc>
+          <w:tcPr>
+            <w:tcW w:type="dxa" w:w="3173"/>
+          </w:tcPr>
+          <w:p>
+            <w:r>
+              <w:rPr>
+                <w:b/>
+              </w:rPr>
+              <w:t>GPT-Live全双工交互控制</w:t>
+            </w:r>
+          </w:p>
+        </w:tc>
+      </w:tr>
+    </w:tbl>
+    <w:tbl>
+      <w:tblPr>
+        <w:tblStyle w:val="LightShading-Accent1"/>
+        <w:tblW w:type="auto" w:w="0"/>
+        <w:tblLook w:firstColumn="1" w:firstRow="1" w:lastColumn="0" w:lastRow="0" w:noHBand="0" w:noVBand="1" w:val="04A0"/>
+      </w:tblPr>
+      <w:tblGrid>
+        <w:gridCol w:w="3173"/>
+        <w:gridCol w:w="3173"/>
+        <w:gridCol w:w="3173"/>
+      </w:tblGrid>
+      <w:tr>
+        <w:tc>
+          <w:tcPr>
+            <w:tcW w:type="dxa" w:w="3173"/>
+          </w:tcPr>
+          <w:p>
+            <w:r>
+              <w:rPr>
+                <w:b/>
+              </w:rPr>
+              <w:t>持续输出音频</w:t>
+            </w:r>
+          </w:p>
+        </w:tc>
+        <w:tc>
+          <w:tcPr>
+            <w:tcW w:type="dxa" w:w="3173"/>
+          </w:tcPr>
+          <w:p>
+            <w:r>
+              <w:t>→</w:t>
+            </w:r>
+          </w:p>
+        </w:tc>
+        <w:tc>
+          <w:tcPr>
+            <w:tcW w:type="dxa" w:w="3173"/>
+          </w:tcPr>
+          <w:p>
+            <w:r>
+              <w:rPr>
+                <w:b/>
+              </w:rPr>
+              <w:t>搜索 / GPT-5.5推理 / Agent任务</w:t>
+            </w:r>
+          </w:p>
+        </w:tc>
+      </w:tr>
+    </w:tbl>
+    <w:tbl>
+      <w:tblPr>
+        <w:tblStyle w:val="LightShading-Accent1"/>
+        <w:tblW w:type="auto" w:w="0"/>
+        <w:tblLook w:firstColumn="1" w:firstRow="1" w:lastColumn="0" w:lastRow="0" w:noHBand="0" w:noVBand="1" w:val="04A0"/>
+      </w:tblPr>
+      <w:tblGrid>
+        <w:gridCol w:w="3173"/>
+        <w:gridCol w:w="3173"/>
+        <w:gridCol w:w="3173"/>
+      </w:tblGrid>
+      <w:tr>
+        <w:tc>
+          <w:tcPr>
+            <w:tcW w:type="dxa" w:w="3173"/>
+          </w:tcPr>
+          <w:p>
+            <w:r>
+              <w:rPr>
+                <w:b/>
+              </w:rPr>
+              <w:t>搜索 / GPT-5.5推理 / Agent任务</w:t>
+            </w:r>
+          </w:p>
+        </w:tc>
+        <w:tc>
+          <w:tcPr>
+            <w:tcW w:type="dxa" w:w="3173"/>
+          </w:tcPr>
+          <w:p>
+            <w:r>
+              <w:t>→</w:t>
+            </w:r>
+          </w:p>
+        </w:tc>
+        <w:tc>
+          <w:tcPr>
+            <w:tcW w:type="dxa" w:w="3173"/>
+          </w:tcPr>
+          <w:p>
+            <w:r>
+              <w:rPr>
+                <w:b/>
+              </w:rPr>
+              <w:t>异步返回结果</w:t>
+            </w:r>
+          </w:p>
+        </w:tc>
+      </w:tr>
+    </w:tbl>
     <w:p>
       <w:pPr>
         <w:pStyle w:val="Heading3"/>

</xml_diff>